<commit_message>
feat: update commercial proposal template
</commit_message>
<xml_diff>
--- a/KP_Slogi_template.docx
+++ b/KP_Slogi_template.docx
@@ -18,7 +18,7 @@
           <w:sz w:val="40"/>
           <w:szCs w:val="40"/>
         </w:rPr>
-        <w:t>[[SLOGI_P_0]]</w:t>
+        <w:t>Предложение о долгосрочной аренде помещения</w:t>
       </w:r>
     </w:p>
     <w:p>
@@ -34,7 +34,7 @@
           <w:sz w:val="24"/>
           <w:szCs w:val="24"/>
         </w:rPr>
-        <w:t>[[SLOGI_P_1]]</w:t>
+        <w:t>для детского центра развития речи «Слоги»</w:t>
       </w:r>
     </w:p>
     <w:p>
@@ -47,7 +47,7 @@
           <w:sz w:val="19"/>
           <w:szCs w:val="19"/>
         </w:rPr>
-        <w:t xml:space="preserve">[[SLOGI_P_2]]</w:t>
+        <w:t xml:space="preserve">[[SLOGI_FIELD_META]]</w:t>
       </w:r>
       <w:proofErr w:type="gramStart"/>
       <w:r>
@@ -85,7 +85,7 @@
           <w:sz w:val="26"/>
           <w:szCs w:val="26"/>
         </w:rPr>
-        <w:t xml:space="preserve">[[SLOGI_P_3]]</w:t>
+        <w:t xml:space="preserve">01  </w:t>
       </w:r>
       <w:r>
         <w:rPr>
@@ -96,7 +96,7 @@
           <w:sz w:val="26"/>
           <w:szCs w:val="26"/>
         </w:rPr>
-        <w:t/>
+        <w:t>О</w:t>
       </w:r>
       <w:proofErr w:type="gramEnd"/>
       <w:r>
@@ -108,7 +108,7 @@
           <w:sz w:val="26"/>
           <w:szCs w:val="26"/>
         </w:rPr>
-        <w:t xml:space="preserve"/>
+        <w:t xml:space="preserve"> нас</w:t>
       </w:r>
     </w:p>
     <w:p>
@@ -116,22 +116,19 @@
         <w:spacing w:after="160" w:line="300" w:lineRule="auto"/>
       </w:pPr>
       <w:r>
-        <w:t xml:space="preserve">[[SLOGI_P_4]]</w:t>
-      </w:r>
-      <w:r>
-        <w:t/>
-      </w:r>
-      <w:r>
-        <w:t xml:space="preserve"/>
-      </w:r>
-      <w:r>
-        <w:rPr>
-          <w:highlight w:val="yellow"/>
-        </w:rPr>
-        <w:t/>
-      </w:r>
-      <w:r>
-        <w:t xml:space="preserve"/>
+        <w:t xml:space="preserve">«Слоги» — детский центр развития речи: логопедические и нейропсихологические занятия, подготовка к школе, работа с семьями района на регулярной основе. Мы открываем </w:t>
+      </w:r>
+      <w:r>
+        <w:t>центр развития речи</w:t>
+      </w:r>
+      <w:r>
+        <w:t xml:space="preserve"> и ищем помещение для долгосрочной аренды — от </w:t>
+      </w:r>
+      <w:r>
+        <w:t xml:space="preserve">5 </w:t>
+      </w:r>
+      <w:r>
+        <w:t>лет, с перспективой развития сети.</w:t>
       </w:r>
     </w:p>
     <w:p>
@@ -139,7 +136,7 @@
         <w:spacing w:after="160" w:line="300" w:lineRule="auto"/>
       </w:pPr>
       <w:r>
-        <w:t>[[SLOGI_P_5]]</w:t>
+        <w:t>Мы создаем пространство, в котором лети развивают речь и мышление, а родители получают понятный, прозрачный и результативный путь развития своего ребенка.</w:t>
       </w:r>
     </w:p>
     <w:p>
@@ -147,7 +144,7 @@
         <w:spacing w:after="160" w:line="300" w:lineRule="auto"/>
       </w:pPr>
       <w:r>
-        <w:t xml:space="preserve">[[SLOGI_P_6]]</w:t>
+        <w:t xml:space="preserve">Мы помогаем семье говорить на одном языке – буквально и метафорически. </w:t>
       </w:r>
     </w:p>
     <w:p>
@@ -167,7 +164,7 @@
           <w:sz w:val="26"/>
           <w:szCs w:val="26"/>
         </w:rPr>
-        <w:t xml:space="preserve">[[SLOGI_P_7]]</w:t>
+        <w:t xml:space="preserve">02  </w:t>
       </w:r>
       <w:r>
         <w:rPr>
@@ -178,7 +175,7 @@
           <w:sz w:val="26"/>
           <w:szCs w:val="26"/>
         </w:rPr>
-        <w:t/>
+        <w:t>Интересующий</w:t>
       </w:r>
       <w:proofErr w:type="gramEnd"/>
       <w:r>
@@ -190,7 +187,7 @@
           <w:sz w:val="26"/>
           <w:szCs w:val="26"/>
         </w:rPr>
-        <w:t xml:space="preserve"/>
+        <w:t xml:space="preserve"> объект</w:t>
       </w:r>
     </w:p>
     <w:tbl>
@@ -215,12 +212,6 @@
         <w:gridCol w:w="4953"/>
       </w:tblGrid>
       <w:tr>
-        <w:tblPrEx>
-          <w:tblCellMar>
-            <w:top w:w="0" w:type="dxa"/>
-            <w:bottom w:w="0" w:type="dxa"/>
-          </w:tblCellMar>
-        </w:tblPrEx>
         <w:tc>
           <w:tcPr>
             <w:tcW w:w="4953" w:type="dxa"/>
@@ -251,7 +242,7 @@
                 <w:sz w:val="18"/>
                 <w:szCs w:val="18"/>
               </w:rPr>
-              <w:t>[[SLOGI_P_8]]</w:t>
+              <w:t>Адрес</w:t>
             </w:r>
           </w:p>
           <w:p>
@@ -265,7 +256,7 @@
                 <w:szCs w:val="24"/>
                 <w:highlight w:val="yellow"/>
               </w:rPr>
-              <w:t>[[SLOGI_P_9]]</w:t>
+              <w:t>[[SLOGI_FIELD_ADDRESS]]</w:t>
             </w:r>
           </w:p>
         </w:tc>
@@ -299,7 +290,7 @@
                 <w:sz w:val="18"/>
                 <w:szCs w:val="18"/>
               </w:rPr>
-              <w:t>[[SLOGI_P_10]]</w:t>
+              <w:t>Площадь</w:t>
             </w:r>
           </w:p>
           <w:p>
@@ -313,7 +304,7 @@
                 <w:szCs w:val="24"/>
                 <w:highlight w:val="yellow"/>
               </w:rPr>
-              <w:t>[[SLOGI_P_11]]</w:t>
+              <w:t>[[SLOGI_FIELD_AREA]]</w:t>
             </w:r>
           </w:p>
         </w:tc>
@@ -346,12 +337,6 @@
         <w:gridCol w:w="4953"/>
       </w:tblGrid>
       <w:tr>
-        <w:tblPrEx>
-          <w:tblCellMar>
-            <w:top w:w="0" w:type="dxa"/>
-            <w:bottom w:w="0" w:type="dxa"/>
-          </w:tblCellMar>
-        </w:tblPrEx>
         <w:tc>
           <w:tcPr>
             <w:tcW w:w="4953" w:type="dxa"/>
@@ -382,7 +367,7 @@
                 <w:sz w:val="18"/>
                 <w:szCs w:val="18"/>
               </w:rPr>
-              <w:t>[[SLOGI_P_12]]</w:t>
+              <w:t>Этаж / вход</w:t>
             </w:r>
           </w:p>
           <w:p>
@@ -396,7 +381,7 @@
                 <w:szCs w:val="24"/>
                 <w:highlight w:val="yellow"/>
               </w:rPr>
-              <w:t>[[SLOGI_P_13]]</w:t>
+              <w:t>[[SLOGI_FIELD_FLOOR_ENTRANCE]]</w:t>
             </w:r>
           </w:p>
         </w:tc>
@@ -430,7 +415,7 @@
                 <w:sz w:val="18"/>
                 <w:szCs w:val="18"/>
               </w:rPr>
-              <w:t>[[SLOGI_P_14]]</w:t>
+              <w:t>Планируемое назначение</w:t>
             </w:r>
           </w:p>
           <w:p>
@@ -443,7 +428,7 @@
                 <w:sz w:val="24"/>
                 <w:szCs w:val="24"/>
               </w:rPr>
-              <w:t>[[SLOGI_P_15]]</w:t>
+              <w:t>Детский центр развития речи</w:t>
             </w:r>
           </w:p>
         </w:tc>
@@ -466,7 +451,7 @@
           <w:sz w:val="26"/>
           <w:szCs w:val="26"/>
         </w:rPr>
-        <w:t xml:space="preserve">[[SLOGI_P_16]]</w:t>
+        <w:t xml:space="preserve">03  </w:t>
       </w:r>
       <w:r>
         <w:rPr>
@@ -477,7 +462,7 @@
           <w:sz w:val="26"/>
           <w:szCs w:val="26"/>
         </w:rPr>
-        <w:t/>
+        <w:t>Коммерческие</w:t>
       </w:r>
       <w:proofErr w:type="gramEnd"/>
       <w:r>
@@ -489,7 +474,7 @@
           <w:sz w:val="26"/>
           <w:szCs w:val="26"/>
         </w:rPr>
-        <w:t xml:space="preserve"/>
+        <w:t xml:space="preserve"> условия</w:t>
       </w:r>
     </w:p>
     <w:p>
@@ -497,12 +482,43 @@
         <w:spacing w:after="160" w:line="300" w:lineRule="auto"/>
       </w:pPr>
       <w:r>
-        <w:t>[[SLOGI_P_17]]</w:t>
+        <w:t>Предлагаемые нами условия аренды:</w:t>
+      </w:r>
+    </w:p>
+    <w:p>
+      <w:pPr>
+        <w:spacing w:after="40"/>
+      </w:pPr>
+      <w:r>
+        <w:rPr>
+          <w:caps/>
+          <w:color w:val="6B6560"/>
+          <w:spacing w:val="10"/>
+          <w:sz w:val="18"/>
+          <w:szCs w:val="18"/>
+        </w:rPr>
+        <w:t>Срок аренды</w:t>
+      </w:r>
+    </w:p>
+    <w:p>
+      <w:pPr>
+        <w:spacing w:after="160" w:line="300" w:lineRule="auto"/>
+      </w:pPr>
+      <w:r>
+        <w:rPr>
+          <w:rFonts w:ascii="Georgia" w:eastAsia="Georgia" w:hAnsi="Georgia" w:cs="Georgia"/>
+          <w:b/>
+          <w:bCs/>
+          <w:color w:val="3A555B"/>
+          <w:sz w:val="24"/>
+          <w:szCs w:val="24"/>
+        </w:rPr>
+        <w:t>5 лет с правом пролонгации</w:t>
       </w:r>
     </w:p>
     <w:tbl>
       <w:tblPr>
-        <w:tblW w:w="9906" w:type="dxa"/>
+        <w:tblW w:w="9918" w:type="dxa"/>
         <w:tblBorders>
           <w:top w:val="none" w:sz="0" w:space="0" w:color="FFFFFF"/>
           <w:left w:val="none" w:sz="0" w:space="0" w:color="FFFFFF"/>
@@ -518,20 +534,13 @@
         <w:tblLook w:val="04A0" w:firstRow="1" w:lastRow="0" w:firstColumn="1" w:lastColumn="0" w:noHBand="0" w:noVBand="1"/>
       </w:tblPr>
       <w:tblGrid>
-        <w:gridCol w:w="3302"/>
-        <w:gridCol w:w="3302"/>
-        <w:gridCol w:w="3302"/>
+        <w:gridCol w:w="4815"/>
+        <w:gridCol w:w="5103"/>
       </w:tblGrid>
       <w:tr>
-        <w:tblPrEx>
-          <w:tblCellMar>
-            <w:top w:w="0" w:type="dxa"/>
-            <w:bottom w:w="0" w:type="dxa"/>
-          </w:tblCellMar>
-        </w:tblPrEx>
         <w:tc>
           <w:tcPr>
-            <w:tcW w:w="3302" w:type="dxa"/>
+            <w:tcW w:w="4815" w:type="dxa"/>
             <w:tcBorders>
               <w:top w:val="single" w:sz="4" w:space="0" w:color="F3E7E2"/>
               <w:left w:val="single" w:sz="4" w:space="0" w:color="F3E7E2"/>
@@ -571,7 +580,7 @@
                 <w:sz w:val="18"/>
                 <w:szCs w:val="18"/>
               </w:rPr>
-              <w:t>[[SLOGI_P_18]]</w:t>
+              <w:t>Желаемая ставка</w:t>
             </w:r>
           </w:p>
           <w:p>
@@ -585,7 +594,7 @@
                 <w:szCs w:val="24"/>
                 <w:highlight w:val="yellow"/>
               </w:rPr>
-              <w:t>[[SLOGI_P_19]]</w:t>
+              <w:t>[[SLOGI_FIELD_BASE_RATE]]</w:t>
             </w:r>
             <w:r>
               <w:rPr>
@@ -596,7 +605,7 @@
                 <w:sz w:val="24"/>
                 <w:szCs w:val="24"/>
               </w:rPr>
-              <w:t xml:space="preserve"/>
+              <w:t xml:space="preserve"> ₽ / м² / мес. (</w:t>
             </w:r>
             <w:r>
               <w:rPr>
@@ -608,7 +617,7 @@
                 <w:szCs w:val="24"/>
                 <w:highlight w:val="yellow"/>
               </w:rPr>
-              <w:t/>
+              <w:t>[[SLOGI_FIELD_BASE_NOTE]]</w:t>
             </w:r>
             <w:r>
               <w:rPr>
@@ -619,13 +628,13 @@
                 <w:sz w:val="24"/>
                 <w:szCs w:val="24"/>
               </w:rPr>
-              <w:t/>
+              <w:t>)</w:t>
             </w:r>
           </w:p>
         </w:tc>
         <w:tc>
           <w:tcPr>
-            <w:tcW w:w="3302" w:type="dxa"/>
+            <w:tcW w:w="5103" w:type="dxa"/>
             <w:tcBorders>
               <w:top w:val="single" w:sz="4" w:space="0" w:color="F3E7E2"/>
               <w:left w:val="single" w:sz="4" w:space="0" w:color="F3E7E2"/>
@@ -653,7 +662,7 @@
                 <w:sz w:val="18"/>
                 <w:szCs w:val="18"/>
               </w:rPr>
-              <w:t>[[SLOGI_P_20]]</w:t>
+              <w:t>Арендные каникулы</w:t>
             </w:r>
           </w:p>
           <w:p>
@@ -667,7 +676,7 @@
                 <w:szCs w:val="24"/>
                 <w:highlight w:val="yellow"/>
               </w:rPr>
-              <w:t>[[SLOGI_P_21]]</w:t>
+              <w:t>[[SLOGI_FIELD_RENT_FREE_DAYS]]</w:t>
             </w:r>
             <w:r>
               <w:rPr>
@@ -678,13 +687,15 @@
                 <w:sz w:val="24"/>
                 <w:szCs w:val="24"/>
               </w:rPr>
-              <w:t xml:space="preserve"/>
+              <w:t xml:space="preserve"> дней на время ремонта</w:t>
             </w:r>
           </w:p>
         </w:tc>
+      </w:tr>
+      <w:tr>
         <w:tc>
           <w:tcPr>
-            <w:tcW w:w="3302" w:type="dxa"/>
+            <w:tcW w:w="4815" w:type="dxa"/>
             <w:tcBorders>
               <w:top w:val="single" w:sz="4" w:space="0" w:color="F3E7E2"/>
               <w:left w:val="single" w:sz="4" w:space="0" w:color="F3E7E2"/>
@@ -703,8 +714,6 @@
           <w:p>
             <w:pPr>
               <w:spacing w:after="40"/>
-            </w:pPr>
-            <w:r>
               <w:rPr>
                 <w:caps/>
                 <w:color w:val="6B6560"/>
@@ -712,10 +721,41 @@
                 <w:sz w:val="18"/>
                 <w:szCs w:val="18"/>
               </w:rPr>
-              <w:t>[[SLOGI_P_22]]</w:t>
-            </w:r>
+            </w:pPr>
           </w:p>
           <w:p>
+            <w:pPr>
+              <w:spacing w:after="40"/>
+              <w:rPr>
+                <w:caps/>
+                <w:color w:val="6B6560"/>
+                <w:spacing w:val="10"/>
+                <w:sz w:val="18"/>
+                <w:szCs w:val="18"/>
+              </w:rPr>
+            </w:pPr>
+            <w:r>
+              <w:rPr>
+                <w:caps/>
+                <w:color w:val="6B6560"/>
+                <w:spacing w:val="10"/>
+                <w:sz w:val="18"/>
+                <w:szCs w:val="18"/>
+              </w:rPr>
+              <w:t>ставка на льготный период</w:t>
+            </w:r>
+          </w:p>
+          <w:p>
+            <w:pPr>
+              <w:spacing w:after="40"/>
+              <w:rPr>
+                <w:caps/>
+                <w:color w:val="6B6560"/>
+                <w:spacing w:val="10"/>
+                <w:sz w:val="18"/>
+                <w:szCs w:val="18"/>
+              </w:rPr>
+            </w:pPr>
             <w:r>
               <w:rPr>
                 <w:rFonts w:ascii="Georgia" w:eastAsia="Georgia" w:hAnsi="Georgia" w:cs="Georgia"/>
@@ -724,8 +764,119 @@
                 <w:color w:val="3A555B"/>
                 <w:sz w:val="24"/>
                 <w:szCs w:val="24"/>
-              </w:rPr>
-              <w:t>[[SLOGI_P_23]]</w:t>
+                <w:highlight w:val="yellow"/>
+              </w:rPr>
+              <w:t>[[SLOGI_FIELD_DISCOUNT_RATE]]</w:t>
+            </w:r>
+            <w:r>
+              <w:rPr>
+                <w:rFonts w:ascii="Georgia" w:eastAsia="Georgia" w:hAnsi="Georgia" w:cs="Georgia"/>
+                <w:b/>
+                <w:bCs/>
+                <w:color w:val="3A555B"/>
+                <w:sz w:val="24"/>
+                <w:szCs w:val="24"/>
+              </w:rPr>
+              <w:t xml:space="preserve"> ₽ / м² / мес. (</w:t>
+            </w:r>
+            <w:r>
+              <w:rPr>
+                <w:rFonts w:ascii="Georgia" w:eastAsia="Georgia" w:hAnsi="Georgia" w:cs="Georgia"/>
+                <w:b/>
+                <w:bCs/>
+                <w:color w:val="3A555B"/>
+                <w:sz w:val="24"/>
+                <w:szCs w:val="24"/>
+                <w:highlight w:val="yellow"/>
+              </w:rPr>
+              <w:t>[[SLOGI_FIELD_DISCOUNT_NOTE]]</w:t>
+            </w:r>
+            <w:r>
+              <w:rPr>
+                <w:rFonts w:ascii="Georgia" w:eastAsia="Georgia" w:hAnsi="Georgia" w:cs="Georgia"/>
+                <w:b/>
+                <w:bCs/>
+                <w:color w:val="3A555B"/>
+                <w:sz w:val="24"/>
+                <w:szCs w:val="24"/>
+              </w:rPr>
+              <w:t>)</w:t>
+            </w:r>
+          </w:p>
+        </w:tc>
+        <w:tc>
+          <w:tcPr>
+            <w:tcW w:w="5103" w:type="dxa"/>
+            <w:tcBorders>
+              <w:top w:val="single" w:sz="4" w:space="0" w:color="F3E7E2"/>
+              <w:left w:val="single" w:sz="4" w:space="0" w:color="F3E7E2"/>
+              <w:bottom w:val="single" w:sz="4" w:space="0" w:color="F3E7E2"/>
+              <w:right w:val="single" w:sz="4" w:space="0" w:color="F3E7E2"/>
+            </w:tcBorders>
+            <w:shd w:val="clear" w:color="auto" w:fill="FFF5F4"/>
+            <w:tcMar>
+              <w:top w:w="160" w:type="dxa"/>
+              <w:left w:w="220" w:type="dxa"/>
+              <w:bottom w:w="160" w:type="dxa"/>
+              <w:right w:w="220" w:type="dxa"/>
+            </w:tcMar>
+            <w:vAlign w:val="center"/>
+          </w:tcPr>
+          <w:p>
+            <w:pPr>
+              <w:spacing w:after="40"/>
+              <w:rPr>
+                <w:caps/>
+                <w:color w:val="6B6560"/>
+                <w:spacing w:val="10"/>
+                <w:sz w:val="18"/>
+                <w:szCs w:val="18"/>
+              </w:rPr>
+            </w:pPr>
+            <w:r>
+              <w:rPr>
+                <w:caps/>
+                <w:color w:val="6B6560"/>
+                <w:spacing w:val="10"/>
+                <w:sz w:val="18"/>
+                <w:szCs w:val="18"/>
+              </w:rPr>
+              <w:t>Срок льготного периодна</w:t>
+            </w:r>
+          </w:p>
+          <w:p>
+            <w:pPr>
+              <w:spacing w:after="40"/>
+              <w:rPr>
+                <w:caps/>
+                <w:color w:val="6B6560"/>
+                <w:spacing w:val="10"/>
+                <w:sz w:val="18"/>
+                <w:szCs w:val="18"/>
+              </w:rPr>
+            </w:pPr>
+            <w:r>
+              <w:rPr>
+                <w:rFonts w:ascii="Georgia" w:eastAsia="Georgia" w:hAnsi="Georgia" w:cs="Georgia"/>
+                <w:b/>
+                <w:bCs/>
+                <w:color w:val="3A555B"/>
+                <w:sz w:val="24"/>
+                <w:szCs w:val="24"/>
+                <w:highlight w:val="yellow"/>
+              </w:rPr>
+              <w:t>[[SLOGI_FIELD_DISCOUNT_PERIOD_DAYS]]</w:t>
+            </w:r>
+            <w:r>
+              <w:rPr>
+                <w:rFonts w:ascii="Georgia" w:eastAsia="Georgia" w:hAnsi="Georgia" w:cs="Georgia"/>
+                <w:b/>
+                <w:bCs/>
+                <w:color w:val="3A555B"/>
+                <w:sz w:val="24"/>
+                <w:szCs w:val="24"/>
+              </w:rPr>
+              <w:t xml:space="preserve"> дней </w:t>
             </w:r>
           </w:p>
         </w:tc>
@@ -735,14 +886,6 @@
       <w:pPr>
         <w:spacing w:before="220"/>
       </w:pPr>
-    </w:p>
-    <w:p>
-      <w:pPr>
-        <w:spacing w:after="160" w:line="300" w:lineRule="auto"/>
-      </w:pPr>
-      <w:r>
-        <w:t>[[SLOGI_P_24]]</w:t>
-      </w:r>
     </w:p>
     <w:p>
       <w:pPr>
@@ -761,7 +904,8 @@
           <w:sz w:val="26"/>
           <w:szCs w:val="26"/>
         </w:rPr>
-        <w:t xml:space="preserve">[[SLOGI_P_25]]</w:t>
+        <w:lastRenderedPageBreak/>
+        <w:t xml:space="preserve">04  </w:t>
       </w:r>
       <w:r>
         <w:rPr>
@@ -772,7 +916,7 @@
           <w:sz w:val="26"/>
           <w:szCs w:val="26"/>
         </w:rPr>
-        <w:t/>
+        <w:t>Сроки</w:t>
       </w:r>
       <w:proofErr w:type="gramEnd"/>
       <w:r>
@@ -784,7 +928,7 @@
           <w:sz w:val="26"/>
           <w:szCs w:val="26"/>
         </w:rPr>
-        <w:t xml:space="preserve"/>
+        <w:t xml:space="preserve"> ремонтных работ</w:t>
       </w:r>
     </w:p>
     <w:p>
@@ -792,7 +936,7 @@
         <w:spacing w:after="160" w:line="300" w:lineRule="auto"/>
       </w:pPr>
       <w:r>
-        <w:t>[[SLOGI_P_26]]</w:t>
+        <w:t>Ориентировочный график подготовки помещения к открытию:</w:t>
       </w:r>
     </w:p>
     <w:tbl>
@@ -818,12 +962,6 @@
         <w:gridCol w:w="2000"/>
       </w:tblGrid>
       <w:tr>
-        <w:tblPrEx>
-          <w:tblCellMar>
-            <w:top w:w="0" w:type="dxa"/>
-            <w:bottom w:w="0" w:type="dxa"/>
-          </w:tblCellMar>
-        </w:tblPrEx>
         <w:trPr>
           <w:tblHeader/>
         </w:trPr>
@@ -854,8 +992,7 @@
                 <w:sz w:val="20"/>
                 <w:szCs w:val="20"/>
               </w:rPr>
-              <w:lastRenderedPageBreak/>
-              <w:t>[[SLOGI_P_27]]</w:t>
+              <w:t>Этап</w:t>
             </w:r>
           </w:p>
         </w:tc>
@@ -886,7 +1023,7 @@
                 <w:sz w:val="20"/>
                 <w:szCs w:val="20"/>
               </w:rPr>
-              <w:t>[[SLOGI_P_28]]</w:t>
+              <w:t>Содержание работ</w:t>
             </w:r>
           </w:p>
         </w:tc>
@@ -917,18 +1054,12 @@
                 <w:sz w:val="20"/>
                 <w:szCs w:val="20"/>
               </w:rPr>
-              <w:t>[[SLOGI_P_29]]</w:t>
+              <w:t>Срок</w:t>
             </w:r>
           </w:p>
         </w:tc>
       </w:tr>
       <w:tr>
-        <w:tblPrEx>
-          <w:tblCellMar>
-            <w:top w:w="0" w:type="dxa"/>
-            <w:bottom w:w="0" w:type="dxa"/>
-          </w:tblCellMar>
-        </w:tblPrEx>
         <w:tc>
           <w:tcPr>
             <w:tcW w:w="1000" w:type="dxa"/>
@@ -953,7 +1084,7 @@
                 <w:sz w:val="20"/>
                 <w:szCs w:val="20"/>
               </w:rPr>
-              <w:t>[[SLOGI_P_30]]</w:t>
+              <w:t>1</w:t>
             </w:r>
           </w:p>
         </w:tc>
@@ -981,7 +1112,7 @@
                 <w:sz w:val="20"/>
                 <w:szCs w:val="20"/>
               </w:rPr>
-              <w:t>[[SLOGI_P_31]]</w:t>
+              <w:t>Проектирование, согласование планировки и дизайн-проекта</w:t>
             </w:r>
           </w:p>
         </w:tc>
@@ -1015,36 +1146,12 @@
                 <w:szCs w:val="20"/>
                 <w:highlight w:val="yellow"/>
               </w:rPr>
-              <w:t xml:space="preserve">[[SLOGI_P_32]]</w:t>
-            </w:r>
-            <w:proofErr w:type="spellStart"/>
-            <w:r>
-              <w:rPr>
-                <w:sz w:val="20"/>
-                <w:szCs w:val="20"/>
-                <w:highlight w:val="yellow"/>
-              </w:rPr>
-              <w:t/>
-            </w:r>
-            <w:proofErr w:type="spellEnd"/>
-            <w:r>
-              <w:rPr>
-                <w:sz w:val="20"/>
-                <w:szCs w:val="20"/>
-                <w:highlight w:val="yellow"/>
-              </w:rPr>
-              <w:t/>
+              <w:t>[[SLOGI_FIELD_REPAIR_STAGE_1]]</w:t>
             </w:r>
           </w:p>
         </w:tc>
       </w:tr>
       <w:tr>
-        <w:tblPrEx>
-          <w:tblCellMar>
-            <w:top w:w="0" w:type="dxa"/>
-            <w:bottom w:w="0" w:type="dxa"/>
-          </w:tblCellMar>
-        </w:tblPrEx>
         <w:tc>
           <w:tcPr>
             <w:tcW w:w="1000" w:type="dxa"/>
@@ -1069,7 +1176,7 @@
                 <w:sz w:val="20"/>
                 <w:szCs w:val="20"/>
               </w:rPr>
-              <w:t>[[SLOGI_P_33]]</w:t>
+              <w:t>2</w:t>
             </w:r>
           </w:p>
         </w:tc>
@@ -1097,7 +1204,7 @@
                 <w:sz w:val="20"/>
                 <w:szCs w:val="20"/>
               </w:rPr>
-              <w:t>[[SLOGI_P_34]]</w:t>
+              <w:t>Демонтаж, инженерные работы (электрика, вентиляция, слаботочные сети)</w:t>
             </w:r>
           </w:p>
         </w:tc>
@@ -1131,36 +1238,12 @@
                 <w:szCs w:val="20"/>
                 <w:highlight w:val="yellow"/>
               </w:rPr>
-              <w:t xml:space="preserve">[[SLOGI_P_35]]</w:t>
-            </w:r>
-            <w:proofErr w:type="spellStart"/>
-            <w:r>
-              <w:rPr>
-                <w:sz w:val="20"/>
-                <w:szCs w:val="20"/>
-                <w:highlight w:val="yellow"/>
-              </w:rPr>
-              <w:t/>
-            </w:r>
-            <w:proofErr w:type="spellEnd"/>
-            <w:r>
-              <w:rPr>
-                <w:sz w:val="20"/>
-                <w:szCs w:val="20"/>
-                <w:highlight w:val="yellow"/>
-              </w:rPr>
-              <w:t/>
+              <w:t>[[SLOGI_FIELD_REPAIR_STAGE_2]]</w:t>
             </w:r>
           </w:p>
         </w:tc>
       </w:tr>
       <w:tr>
-        <w:tblPrEx>
-          <w:tblCellMar>
-            <w:top w:w="0" w:type="dxa"/>
-            <w:bottom w:w="0" w:type="dxa"/>
-          </w:tblCellMar>
-        </w:tblPrEx>
         <w:tc>
           <w:tcPr>
             <w:tcW w:w="1000" w:type="dxa"/>
@@ -1185,7 +1268,7 @@
                 <w:sz w:val="20"/>
                 <w:szCs w:val="20"/>
               </w:rPr>
-              <w:t>[[SLOGI_P_36]]</w:t>
+              <w:t>3</w:t>
             </w:r>
           </w:p>
         </w:tc>
@@ -1213,7 +1296,7 @@
                 <w:sz w:val="20"/>
                 <w:szCs w:val="20"/>
               </w:rPr>
-              <w:t>[[SLOGI_P_37]]</w:t>
+              <w:t>Отделочные работы, звукоизоляция кабинетов</w:t>
             </w:r>
           </w:p>
         </w:tc>
@@ -1242,18 +1325,8 @@
                 <w:szCs w:val="20"/>
                 <w:highlight w:val="yellow"/>
               </w:rPr>
-              <w:t xml:space="preserve">[[SLOGI_P_38]]</w:t>
-            </w:r>
-            <w:proofErr w:type="spellStart"/>
-            <w:r>
-              <w:rPr>
-                <w:sz w:val="20"/>
-                <w:szCs w:val="20"/>
-                <w:highlight w:val="yellow"/>
-              </w:rPr>
-              <w:t/>
-            </w:r>
-            <w:proofErr w:type="spellEnd"/>
+              <w:t>[[SLOGI_FIELD_REPAIR_STAGE_3]]</w:t>
+            </w:r>
             <w:r>
               <w:rPr>
                 <w:sz w:val="20"/>
@@ -1265,12 +1338,6 @@
         </w:tc>
       </w:tr>
       <w:tr>
-        <w:tblPrEx>
-          <w:tblCellMar>
-            <w:top w:w="0" w:type="dxa"/>
-            <w:bottom w:w="0" w:type="dxa"/>
-          </w:tblCellMar>
-        </w:tblPrEx>
         <w:tc>
           <w:tcPr>
             <w:tcW w:w="1000" w:type="dxa"/>
@@ -1295,7 +1362,7 @@
                 <w:sz w:val="20"/>
                 <w:szCs w:val="20"/>
               </w:rPr>
-              <w:t>[[SLOGI_P_39]]</w:t>
+              <w:t>4</w:t>
             </w:r>
           </w:p>
         </w:tc>
@@ -1323,7 +1390,7 @@
                 <w:sz w:val="20"/>
                 <w:szCs w:val="20"/>
               </w:rPr>
-              <w:t>[[SLOGI_P_40]]</w:t>
+              <w:t>Меблировка, брендирование, финальная приёмка</w:t>
             </w:r>
           </w:p>
         </w:tc>
@@ -1352,18 +1419,8 @@
                 <w:szCs w:val="20"/>
                 <w:highlight w:val="yellow"/>
               </w:rPr>
-              <w:t xml:space="preserve">[[SLOGI_P_41]]</w:t>
-            </w:r>
-            <w:proofErr w:type="spellStart"/>
-            <w:r>
-              <w:rPr>
-                <w:sz w:val="20"/>
-                <w:szCs w:val="20"/>
-                <w:highlight w:val="yellow"/>
-              </w:rPr>
-              <w:t/>
-            </w:r>
-            <w:proofErr w:type="spellEnd"/>
+              <w:t>[[SLOGI_FIELD_REPAIR_STAGE_4]]</w:t>
+            </w:r>
             <w:r>
               <w:rPr>
                 <w:sz w:val="20"/>
@@ -1385,16 +1442,16 @@
         <w:spacing w:after="160" w:line="300" w:lineRule="auto"/>
       </w:pPr>
       <w:r>
-        <w:t xml:space="preserve">[[SLOGI_P_42]]</w:t>
+        <w:t xml:space="preserve">Общий срок ремонтно-отделочных работ — </w:t>
       </w:r>
       <w:r>
         <w:rPr>
           <w:highlight w:val="yellow"/>
         </w:rPr>
-        <w:t/>
-      </w:r>
-      <w:r>
-        <w:t xml:space="preserve"/>
+        <w:t>[[SLOGI_FIELD_REPAIR_TOTAL]]</w:t>
+      </w:r>
+      <w:r>
+        <w:t xml:space="preserve"> с даты подписания договора аренды и передачи помещения. Итоговый график будет зафиксирован в приложении к договору после осмотра объекта и согласования дизайн-проекта.</w:t>
       </w:r>
     </w:p>
     <w:p>
@@ -1414,7 +1471,7 @@
           <w:sz w:val="26"/>
           <w:szCs w:val="26"/>
         </w:rPr>
-        <w:t xml:space="preserve">[[SLOGI_P_43]]</w:t>
+        <w:t xml:space="preserve">05  </w:t>
       </w:r>
       <w:r>
         <w:rPr>
@@ -1425,7 +1482,7 @@
           <w:sz w:val="26"/>
           <w:szCs w:val="26"/>
         </w:rPr>
-        <w:t/>
+        <w:t>Почему</w:t>
       </w:r>
       <w:proofErr w:type="gramEnd"/>
       <w:r>
@@ -1437,7 +1494,7 @@
           <w:sz w:val="26"/>
           <w:szCs w:val="26"/>
         </w:rPr>
-        <w:t xml:space="preserve"/>
+        <w:t xml:space="preserve"> сотрудничество с нами выгодно</w:t>
       </w:r>
     </w:p>
     <w:p>
@@ -1451,10 +1508,10 @@
           <w:bCs/>
           <w:color w:val="E39B2F"/>
         </w:rPr>
-        <w:t xml:space="preserve">[[SLOGI_P_44]]</w:t>
-      </w:r>
-      <w:r>
-        <w:t/>
+        <w:t xml:space="preserve">—  </w:t>
+      </w:r>
+      <w:r>
+        <w:t>Долгосрочная аренда — стабильный доход на годы вперёд без простоя и поиска новых арендаторов.</w:t>
       </w:r>
     </w:p>
     <w:p>
@@ -1468,10 +1525,10 @@
           <w:bCs/>
           <w:color w:val="E39B2F"/>
         </w:rPr>
-        <w:t xml:space="preserve">[[SLOGI_P_45]]</w:t>
-      </w:r>
-      <w:r>
-        <w:t/>
+        <w:t xml:space="preserve">—  </w:t>
+      </w:r>
+      <w:r>
+        <w:t>Целевой, некриминальный поток посетителей: родители с детьми, регулярные визиты в одно и то же время.</w:t>
       </w:r>
     </w:p>
     <w:p>
@@ -1485,10 +1542,10 @@
           <w:bCs/>
           <w:color w:val="E39B2F"/>
         </w:rPr>
-        <w:t xml:space="preserve">[[SLOGI_P_46]]</w:t>
-      </w:r>
-      <w:r>
-        <w:t/>
+        <w:t xml:space="preserve">—  </w:t>
+      </w:r>
+      <w:r>
+        <w:t>Бережная эксплуатация помещения: центр детского развития заинтересован в аккуратном и презентабельном виде объекта.</w:t>
       </w:r>
     </w:p>
     <w:p>
@@ -1502,10 +1559,10 @@
           <w:bCs/>
           <w:color w:val="E39B2F"/>
         </w:rPr>
-        <w:t xml:space="preserve">[[SLOGI_P_47]]</w:t>
-      </w:r>
-      <w:r>
-        <w:t/>
+        <w:t xml:space="preserve">—  </w:t>
+      </w:r>
+      <w:r>
+        <w:t>Ремонт и отделка — за счёт арендатора, что повышает качество и рыночную стоимость помещения.</w:t>
       </w:r>
     </w:p>
     <w:p>
@@ -1519,10 +1576,10 @@
           <w:bCs/>
           <w:color w:val="E39B2F"/>
         </w:rPr>
-        <w:t xml:space="preserve">[[SLOGI_P_48]]</w:t>
-      </w:r>
-      <w:r>
-        <w:t/>
+        <w:t xml:space="preserve">—  </w:t>
+      </w:r>
+      <w:r>
+        <w:t>Готовность к прозрачным договорным условиям, страхованию ответственности и своевременным платежам.</w:t>
       </w:r>
     </w:p>
     <w:p>
@@ -1542,7 +1599,7 @@
           <w:sz w:val="26"/>
           <w:szCs w:val="26"/>
         </w:rPr>
-        <w:t xml:space="preserve">[[SLOGI_P_49]]</w:t>
+        <w:t xml:space="preserve">06  </w:t>
       </w:r>
       <w:r>
         <w:rPr>
@@ -1553,7 +1610,7 @@
           <w:sz w:val="26"/>
           <w:szCs w:val="26"/>
         </w:rPr>
-        <w:t/>
+        <w:t>Следующий</w:t>
       </w:r>
       <w:proofErr w:type="gramEnd"/>
       <w:r>
@@ -1565,7 +1622,7 @@
           <w:sz w:val="26"/>
           <w:szCs w:val="26"/>
         </w:rPr>
-        <w:t xml:space="preserve"/>
+        <w:t xml:space="preserve"> шаг</w:t>
       </w:r>
     </w:p>
     <w:p>
@@ -1573,7 +1630,7 @@
         <w:spacing w:after="160" w:line="300" w:lineRule="auto"/>
       </w:pPr>
       <w:r>
-        <w:t>[[SLOGI_P_50]]</w:t>
+        <w:t>Будем рады обсудить условия на встрече или созвоне, провести совместный осмотр помещения и согласовать итоговые параметры договора.</w:t>
       </w:r>
     </w:p>
     <w:p>
@@ -1593,7 +1650,7 @@
           <w:sz w:val="21"/>
           <w:szCs w:val="21"/>
         </w:rPr>
-        <w:t>[[SLOGI_P_51]]</w:t>
+        <w:t>С уважением,</w:t>
       </w:r>
     </w:p>
     <w:p>
@@ -1608,7 +1665,7 @@
           <w:color w:val="3A555B"/>
           <w:highlight w:val="yellow"/>
         </w:rPr>
-        <w:t>[[SLOGI_P_52]]</w:t>
+        <w:t>[[SLOGI_FIELD_SIGNATORY]]</w:t>
       </w:r>
     </w:p>
     <w:p>
@@ -1621,7 +1678,7 @@
           <w:sz w:val="20"/>
           <w:szCs w:val="20"/>
         </w:rPr>
-        <w:t>[[SLOGI_P_53]]</w:t>
+        <w:t>Детский центр развития речи «Слоги»</w:t>
       </w:r>
     </w:p>
     <w:p>
@@ -1635,7 +1692,7 @@
           <w:szCs w:val="20"/>
           <w:highlight w:val="yellow"/>
         </w:rPr>
-        <w:t>[[SLOGI_P_54]]</w:t>
+        <w:t>[[SLOGI_FIELD_CONTACTS]]</w:t>
       </w:r>
       <w:proofErr w:type="gramStart"/>
       <w:r>
@@ -1658,26 +1715,6 @@
         <w:t/>
       </w:r>
       <w:proofErr w:type="gramStart"/>
-      <w:r>
-        <w:rPr>
-          <w:color w:val="6B6560"/>
-          <w:sz w:val="20"/>
-          <w:szCs w:val="20"/>
-          <w:highlight w:val="yellow"/>
-        </w:rPr>
-        <w:t xml:space="preserve"/>
-      </w:r>
-      <w:proofErr w:type="spellStart"/>
-      <w:r>
-        <w:rPr>
-          <w:color w:val="6B6560"/>
-          <w:sz w:val="20"/>
-          <w:szCs w:val="20"/>
-          <w:highlight w:val="yellow"/>
-        </w:rPr>
-        <w:t/>
-      </w:r>
-      <w:proofErr w:type="spellEnd"/>
       <w:r>
         <w:rPr>
           <w:color w:val="6B6560"/>
@@ -2218,12 +2255,6 @@
       <w:gridCol w:w="6000"/>
     </w:tblGrid>
     <w:tr>
-      <w:tblPrEx>
-        <w:tblCellMar>
-          <w:top w:w="0" w:type="dxa"/>
-          <w:bottom w:w="0" w:type="dxa"/>
-        </w:tblCellMar>
-      </w:tblPrEx>
       <w:tc>
         <w:tcPr>
           <w:tcW w:w="6000" w:type="dxa"/>

</xml_diff>